<commit_message>
Updated asset naming conventions
</commit_message>
<xml_diff>
--- a/docs/asset-management/Recording Scripts/S1_Maya_Recording_Script.docx
+++ b/docs/asset-management/Recording Scripts/S1_Maya_Recording_Script.docx
@@ -46,7 +46,7 @@
     </w:p>
     <w:p>
       <w:r>
-        <w:t>This document is named S1_Maya_Recording_Script.docx. For approved spoken lines, use s1-maya-[line ID].mp3 in lowercase, for example s1-maya-m01.mp3. The proposed destination folder is assets/audio/voice/students/maya/scenario-01/. These are proposed production names, not existing or approved runtime audio. Keep on-screen quotes without audio filenames until voice recording is approved.</w:t>
+        <w:t>This document is named S1_Maya_Recording_Script.docx. Use maya_s01_01.mp3 through maya_s01_03.mp3 for the three approved spoken lines. The pattern is speaker, scenario, then two digit line number. Save them in assets/audio/voice/students/maya/scenario-01/. Keep on-screen quotes without audio filenames until a voice decision is approved.</w:t>
       </w:r>
     </w:p>
     <w:p>
@@ -88,7 +88,7 @@
         <w:spacing w:after="200"/>
       </w:pPr>
       <w:r>
-        <w:t>Proposed audio file: assets/audio/voice/students/maya/scenario-01/s1-maya-m01.mp3</w:t>
+        <w:t>Proposed audio file: assets/audio/voice/students/maya/scenario-01/maya_s01_01.mp3</w:t>
       </w:r>
     </w:p>
     <w:p>
@@ -122,7 +122,7 @@
         <w:spacing w:after="200"/>
       </w:pPr>
       <w:r>
-        <w:t>Proposed audio file: assets/audio/voice/students/maya/scenario-01/s1-maya-m02.mp3</w:t>
+        <w:t>Proposed audio file: assets/audio/voice/students/maya/scenario-01/maya_s01_02.mp3</w:t>
       </w:r>
     </w:p>
     <w:p>
@@ -156,7 +156,7 @@
         <w:spacing w:after="200"/>
       </w:pPr>
       <w:r>
-        <w:t>Proposed audio file: assets/audio/voice/students/maya/scenario-01/s1-maya-m03.mp3</w:t>
+        <w:t>Proposed audio file: assets/audio/voice/students/maya/scenario-01/maya_s01_03.mp3</w:t>
       </w:r>
     </w:p>
     <w:p>
@@ -762,7 +762,7 @@
       <w:jc w:val="center"/>
     </w:pPr>
     <w:r>
-      <w:t>PromptCraft V429  |  Patch 575 source  |  Scenario 1 only</w:t>
+      <w:t>PromptCraft V429  |  Patch 580 source  |  Scenario 1 only</w:t>
     </w:r>
   </w:p>
 </w:ftr>

</xml_diff>

<commit_message>
Fixed formatting and App Script
</commit_message>
<xml_diff>
--- a/docs/asset-management/Recording Scripts/S1_Maya_Recording_Script.docx
+++ b/docs/asset-management/Recording Scripts/S1_Maya_Recording_Script.docx
@@ -20,7 +20,7 @@
     </w:p>
     <w:p>
       <w:r>
-        <w:t>This script lists the current Scenario 1 lines from the application source. Spoken dialogue is ready for wording review. On-screen quotes are included for context and must receive a separate voice decision before recording.</w:t>
+        <w:t>This script contains Maya’s three current spoken lines plus every fixed and conditional Maya line displayed during Scenario 1. It separates the approved recording queue from optional voice decisions.</w:t>
       </w:r>
     </w:p>
     <w:p>
@@ -28,12 +28,12 @@
         <w:pStyle w:val="Heading1"/>
       </w:pPr>
       <w:r>
-        <w:t>Recording decision</w:t>
+        <w:t>Recording plan</w:t>
       </w:r>
     </w:p>
     <w:p>
       <w:r>
-        <w:t>Record only rows labeled Spoken dialogue after the producer approves the wording and proposed file name. Do not record conditional text with placeholders. Recheck the source before a session because the application may change.</w:t>
+        <w:t>Record M01 through M03 after wording approval. M04 through M19 are included so every fixed and conditional Maya line is documented. Record an optional line only after its voice decision is approved. M14 and M15 contain runtime values and cannot use one fixed recording.</w:t>
       </w:r>
     </w:p>
     <w:p>
@@ -41,12 +41,12 @@
         <w:pStyle w:val="Heading1"/>
       </w:pPr>
       <w:r>
-        <w:t>File naming</w:t>
+        <w:t>File naming and delivery</w:t>
       </w:r>
     </w:p>
     <w:p>
       <w:r>
-        <w:t>This document is named S1_Maya_Recording_Script.docx. Use maya_s01_01.mp3 through maya_s01_03.mp3 for the three approved spoken lines. The pattern is speaker, scenario, then two digit line number. Save them in assets/audio/voice/students/maya/scenario-01/. Keep on-screen quotes without audio filenames until a voice decision is approved.</w:t>
+        <w:t>Use maya_s01_XX.mp3, where XX matches the two digit line number shown in this script. Save every approved file in assets/audio/voice/students/maya/scenario-01/. Use one file per line. Do not add dates, versions, spaces, or words such as final to the filename.</w:t>
       </w:r>
     </w:p>
     <w:p>
@@ -54,7 +54,7 @@
         <w:pStyle w:val="Heading1"/>
       </w:pPr>
       <w:r>
-        <w:t>Line list</w:t>
+        <w:t>Main recording queue</w:t>
       </w:r>
     </w:p>
     <w:p>
@@ -66,29 +66,34 @@
       </w:r>
     </w:p>
     <w:p>
+      <w:pPr>
+        <w:keepNext/>
+        <w:keepLines/>
+      </w:pPr>
       <w:r>
+        <w:rPr>
+          <w:b/>
+        </w:rPr>
         <w:t>The module has five activities, but the names do not tell me much. I keep opening things just to figure out what they are.</w:t>
       </w:r>
     </w:p>
     <w:p>
       <w:pPr>
-        <w:spacing w:after="240"/>
+        <w:keepLines/>
       </w:pPr>
       <w:r>
         <w:rPr>
           <w:i/>
-          <w:color w:val="4D5B68"/>
-          <w:sz w:val="17"/>
         </w:rPr>
-        <w:t>Spoken dialogue  |  Source: m-s1-start-02</w:t>
+        <w:t>Use: Record now  |  Expression: uncertain</w:t>
+        <w:br/>
       </w:r>
-    </w:p>
-    <w:p>
-      <w:pPr>
-        <w:spacing w:after="200"/>
-      </w:pPr>
       <w:r>
-        <w:t>Proposed audio file: assets/audio/voice/students/maya/scenario-01/maya_s01_01.mp3</w:t>
+        <w:t>Source: m-s1-start-02</w:t>
+        <w:br/>
+      </w:r>
+      <w:r>
+        <w:t>File: assets/audio/voice/students/maya/scenario-01/maya_s01_01.mp3</w:t>
       </w:r>
     </w:p>
     <w:p>
@@ -100,29 +105,34 @@
       </w:r>
     </w:p>
     <w:p>
+      <w:pPr>
+        <w:keepNext/>
+        <w:keepLines/>
+      </w:pPr>
       <w:r>
+        <w:rPr>
+          <w:b/>
+        </w:rPr>
         <w:t>This is much easier to follow. I can see the path before I start clicking, and the titles tell me what each activity is for.</w:t>
       </w:r>
     </w:p>
     <w:p>
       <w:pPr>
-        <w:spacing w:after="240"/>
+        <w:keepLines/>
       </w:pPr>
       <w:r>
         <w:rPr>
           <w:i/>
-          <w:color w:val="4D5B68"/>
-          <w:sz w:val="17"/>
         </w:rPr>
-        <w:t>Spoken dialogue  |  Source: pcPlayS1OverviewReflection</w:t>
+        <w:t>Use: Record now  |  Expression: neutral</w:t>
+        <w:br/>
       </w:r>
-    </w:p>
-    <w:p>
-      <w:pPr>
-        <w:spacing w:after="200"/>
-      </w:pPr>
       <w:r>
-        <w:t>Proposed audio file: assets/audio/voice/students/maya/scenario-01/maya_s01_02.mp3</w:t>
+        <w:t>Source: pcPlayS1OverviewReflection</w:t>
+        <w:br/>
+      </w:r>
+      <w:r>
+        <w:t>File: assets/audio/voice/students/maya/scenario-01/maya_s01_02.mp3</w:t>
       </w:r>
     </w:p>
     <w:p>
@@ -134,29 +144,47 @@
       </w:r>
     </w:p>
     <w:p>
+      <w:pPr>
+        <w:keepNext/>
+        <w:keepLines/>
+      </w:pPr>
       <w:r>
+        <w:rPr>
+          <w:b/>
+        </w:rPr>
         <w:t>The clearer names and headers helped me find my way. They did not change what the activities actually ask me to demonstrate.</w:t>
       </w:r>
     </w:p>
     <w:p>
       <w:pPr>
-        <w:spacing w:after="240"/>
+        <w:keepLines/>
       </w:pPr>
       <w:r>
         <w:rPr>
           <w:i/>
-          <w:color w:val="4D5B68"/>
-          <w:sz w:val="17"/>
         </w:rPr>
-        <w:t>Spoken dialogue  |  Source: pcPlayS1MyCourseTransition</w:t>
+        <w:t>Use: Record now  |  Expression: neutral</w:t>
+        <w:br/>
+      </w:r>
+      <w:r>
+        <w:t>Source: pcPlayS1MyCourseTransition</w:t>
+        <w:br/>
+      </w:r>
+      <w:r>
+        <w:t>File: assets/audio/voice/students/maya/scenario-01/maya_s01_03.mp3</w:t>
       </w:r>
     </w:p>
     <w:p>
       <w:pPr>
-        <w:spacing w:after="200"/>
+        <w:pStyle w:val="Heading1"/>
       </w:pPr>
       <w:r>
-        <w:t>Proposed audio file: assets/audio/voice/students/maya/scenario-01/maya_s01_03.mp3</w:t>
+        <w:t>Optional and conditional Maya lines</w:t>
+      </w:r>
+    </w:p>
+    <w:p>
+      <w:r>
+        <w:t>These lines are currently displayed on screen. Their filenames are reserved now so they can be recorded later without renaming the approved main queue.</w:t>
       </w:r>
     </w:p>
     <w:p>
@@ -168,29 +196,34 @@
       </w:r>
     </w:p>
     <w:p>
+      <w:pPr>
+        <w:keepNext/>
+        <w:keepLines/>
+      </w:pPr>
       <w:r>
+        <w:rPr>
+          <w:b/>
+        </w:rPr>
         <w:t>These file names do not tell me much about what I am supposed to do first. I would probably start clicking until something made sense.</w:t>
       </w:r>
     </w:p>
     <w:p>
       <w:pPr>
-        <w:spacing w:after="240"/>
+        <w:keepLines/>
       </w:pPr>
       <w:r>
         <w:rPr>
           <w:i/>
-          <w:color w:val="4D5B68"/>
-          <w:sz w:val="17"/>
         </w:rPr>
-        <w:t>On-screen quote  |  Source: PC_S1_LEARNING_DEFAULT_QUOTE</w:t>
+        <w:t>Use: Optional voice if approved  |  Expression: neutral</w:t>
+        <w:br/>
       </w:r>
-    </w:p>
-    <w:p>
-      <w:pPr>
-        <w:spacing w:after="200"/>
-      </w:pPr>
       <w:r>
-        <w:t>Audio file: none assigned; voice decision pending</w:t>
+        <w:t>Source: PC_S1_LEARNING_DEFAULT_QUOTE</w:t>
+        <w:br/>
+      </w:r>
+      <w:r>
+        <w:t>File: assets/audio/voice/students/maya/scenario-01/maya_s01_04.mp3</w:t>
       </w:r>
     </w:p>
     <w:p>
@@ -202,29 +235,34 @@
       </w:r>
     </w:p>
     <w:p>
+      <w:pPr>
+        <w:keepNext/>
+        <w:keepLines/>
+      </w:pPr>
       <w:r>
+        <w:rPr>
+          <w:b/>
+        </w:rPr>
         <w:t>This reading explains how where people live can shape access to affordable, nutritious food and how that can affect health.</w:t>
       </w:r>
     </w:p>
     <w:p>
       <w:pPr>
-        <w:spacing w:after="240"/>
+        <w:keepLines/>
       </w:pPr>
       <w:r>
         <w:rPr>
           <w:i/>
-          <w:color w:val="4D5B68"/>
-          <w:sz w:val="17"/>
         </w:rPr>
-        <w:t>On-screen quote  |  Source: PC_S1_LEARNING_ITEMS food-access-reading</w:t>
+        <w:t>Use: Optional voice if approved  |  Expression: neutral</w:t>
+        <w:br/>
       </w:r>
-    </w:p>
-    <w:p>
-      <w:pPr>
-        <w:spacing w:after="200"/>
-      </w:pPr>
       <w:r>
-        <w:t>Audio file: none assigned; voice decision pending</w:t>
+        <w:t>Source: PC_S1_LEARNING_ITEMS food-access-reading</w:t>
+        <w:br/>
+      </w:r>
+      <w:r>
+        <w:t>File: assets/audio/voice/students/maya/scenario-01/maya_s01_05.mp3</w:t>
       </w:r>
     </w:p>
     <w:p>
@@ -236,29 +274,34 @@
       </w:r>
     </w:p>
     <w:p>
+      <w:pPr>
+        <w:keepNext/>
+        <w:keepLines/>
+      </w:pPr>
       <w:r>
+        <w:rPr>
+          <w:b/>
+        </w:rPr>
         <w:t>This was the short video about what a food desert is, how it can affect a community, and some barriers people face when trying to get nutritious food.</w:t>
       </w:r>
     </w:p>
     <w:p>
       <w:pPr>
-        <w:spacing w:after="240"/>
+        <w:keepLines/>
       </w:pPr>
       <w:r>
         <w:rPr>
           <w:i/>
-          <w:color w:val="4D5B68"/>
-          <w:sz w:val="17"/>
         </w:rPr>
-        <w:t>On-screen quote  |  Source: PC_S1_LEARNING_ITEMS food-access-video</w:t>
+        <w:t>Use: Optional voice if approved  |  Expression: neutral</w:t>
+        <w:br/>
       </w:r>
-    </w:p>
-    <w:p>
-      <w:pPr>
-        <w:spacing w:after="200"/>
-      </w:pPr>
       <w:r>
-        <w:t>Audio file: none assigned; voice decision pending</w:t>
+        <w:t>Source: PC_S1_LEARNING_ITEMS food-access-video</w:t>
+        <w:br/>
+      </w:r>
+      <w:r>
+        <w:t>File: assets/audio/voice/students/maya/scenario-01/maya_s01_06.mp3</w:t>
       </w:r>
     </w:p>
     <w:p>
@@ -270,29 +313,34 @@
       </w:r>
     </w:p>
     <w:p>
+      <w:pPr>
+        <w:keepNext/>
+        <w:keepLines/>
+      </w:pPr>
       <w:r>
+        <w:rPr>
+          <w:b/>
+        </w:rPr>
         <w:t>This page is mostly vocabulary: food access, food insecurity, food desert, transportation barrier, and social determinants of health.</w:t>
       </w:r>
     </w:p>
     <w:p>
       <w:pPr>
-        <w:spacing w:after="240"/>
+        <w:keepLines/>
       </w:pPr>
       <w:r>
         <w:rPr>
           <w:i/>
-          <w:color w:val="4D5B68"/>
-          <w:sz w:val="17"/>
         </w:rPr>
-        <w:t>On-screen quote  |  Source: PC_S1_LEARNING_ITEMS module-terms</w:t>
+        <w:t>Use: Optional voice if approved  |  Expression: neutral</w:t>
+        <w:br/>
       </w:r>
-    </w:p>
-    <w:p>
-      <w:pPr>
-        <w:spacing w:after="200"/>
-      </w:pPr>
       <w:r>
-        <w:t>Audio file: none assigned; voice decision pending</w:t>
+        <w:t>Source: PC_S1_LEARNING_ITEMS module-terms</w:t>
+        <w:br/>
+      </w:r>
+      <w:r>
+        <w:t>File: assets/audio/voice/students/maya/scenario-01/maya_s01_07.mp3</w:t>
       </w:r>
     </w:p>
     <w:p>
@@ -304,29 +352,34 @@
       </w:r>
     </w:p>
     <w:p>
+      <w:pPr>
+        <w:keepNext/>
+        <w:keepLines/>
+      </w:pPr>
       <w:r>
+        <w:rPr>
+          <w:b/>
+        </w:rPr>
         <w:t>This discussion asks me to describe one food-access barrier in a community and respond to two classmates.</w:t>
       </w:r>
     </w:p>
     <w:p>
       <w:pPr>
-        <w:spacing w:after="240"/>
+        <w:keepLines/>
       </w:pPr>
       <w:r>
         <w:rPr>
           <w:i/>
-          <w:color w:val="4D5B68"/>
-          <w:sz w:val="17"/>
         </w:rPr>
-        <w:t>On-screen quote  |  Source: PC_S1_LEARNING_ITEMS discussion-3</w:t>
+        <w:t>Use: Optional voice if approved  |  Expression: neutral</w:t>
+        <w:br/>
       </w:r>
-    </w:p>
-    <w:p>
-      <w:pPr>
-        <w:spacing w:after="200"/>
-      </w:pPr>
       <w:r>
-        <w:t>Audio file: none assigned; voice decision pending</w:t>
+        <w:t>Source: PC_S1_LEARNING_ITEMS discussion-3</w:t>
+        <w:br/>
+      </w:r>
+      <w:r>
+        <w:t>File: assets/audio/voice/students/maya/scenario-01/maya_s01_08.mp3</w:t>
       </w:r>
     </w:p>
     <w:p>
@@ -338,29 +391,34 @@
       </w:r>
     </w:p>
     <w:p>
+      <w:pPr>
+        <w:keepNext/>
+        <w:keepLines/>
+      </w:pPr>
       <w:r>
+        <w:rPr>
+          <w:b/>
+        </w:rPr>
         <w:t>This quiz checks whether I remember the main terms and examples from the reading and video.</w:t>
       </w:r>
     </w:p>
     <w:p>
       <w:pPr>
-        <w:spacing w:after="240"/>
+        <w:keepLines/>
       </w:pPr>
       <w:r>
         <w:rPr>
           <w:i/>
-          <w:color w:val="4D5B68"/>
-          <w:sz w:val="17"/>
         </w:rPr>
-        <w:t>On-screen quote  |  Source: PC_S1_LEARNING_ITEMS quiz-3</w:t>
+        <w:t>Use: Optional voice if approved  |  Expression: neutral</w:t>
+        <w:br/>
       </w:r>
-    </w:p>
-    <w:p>
-      <w:pPr>
-        <w:spacing w:after="200"/>
-      </w:pPr>
       <w:r>
-        <w:t>Audio file: none assigned; voice decision pending</w:t>
+        <w:t>Source: PC_S1_LEARNING_ITEMS quiz-3</w:t>
+        <w:br/>
+      </w:r>
+      <w:r>
+        <w:t>File: assets/audio/voice/students/maya/scenario-01/maya_s01_09.mp3</w:t>
       </w:r>
     </w:p>
     <w:p>
@@ -372,29 +430,34 @@
       </w:r>
     </w:p>
     <w:p>
+      <w:pPr>
+        <w:keepNext/>
+        <w:keepLines/>
+      </w:pPr>
       <w:r>
+        <w:rPr>
+          <w:b/>
+        </w:rPr>
         <w:t>I can tell what these activities are now. Next I need to understand how they fit together, not just what they are called.</w:t>
       </w:r>
     </w:p>
     <w:p>
       <w:pPr>
-        <w:spacing w:after="240"/>
+        <w:keepLines/>
       </w:pPr>
       <w:r>
         <w:rPr>
           <w:i/>
-          <w:color w:val="4D5B68"/>
-          <w:sz w:val="17"/>
         </w:rPr>
-        <w:t>On-screen quote  |  Source: pcRenderS1RenameComplete</w:t>
+        <w:t>Use: Optional voice if approved  |  Expression: neutral</w:t>
+        <w:br/>
       </w:r>
-    </w:p>
-    <w:p>
-      <w:pPr>
-        <w:spacing w:after="200"/>
-      </w:pPr>
       <w:r>
-        <w:t>Audio file: none assigned; voice decision pending</w:t>
+        <w:t>Source: pcRenderS1RenameComplete</w:t>
+        <w:br/>
+      </w:r>
+      <w:r>
+        <w:t>File: assets/audio/voice/students/maya/scenario-01/maya_s01_10.mp3</w:t>
       </w:r>
     </w:p>
     <w:p>
@@ -406,29 +469,34 @@
       </w:r>
     </w:p>
     <w:p>
+      <w:pPr>
+        <w:keepNext/>
+        <w:keepLines/>
+      </w:pPr>
       <w:r>
+        <w:rPr>
+          <w:b/>
+        </w:rPr>
         <w:t>These headings help me see the learning path. I need to decide whether each activity prepares me, lets me practice, or shows what I can actually do.</w:t>
       </w:r>
     </w:p>
     <w:p>
       <w:pPr>
-        <w:spacing w:after="240"/>
+        <w:keepLines/>
       </w:pPr>
       <w:r>
         <w:rPr>
           <w:i/>
-          <w:color w:val="4D5B68"/>
-          <w:sz w:val="17"/>
         </w:rPr>
-        <w:t>On-screen quote  |  Source: pcStartS1Organize</w:t>
+        <w:t>Use: Optional voice if approved  |  Expression: neutral</w:t>
+        <w:br/>
       </w:r>
-    </w:p>
-    <w:p>
-      <w:pPr>
-        <w:spacing w:after="200"/>
-      </w:pPr>
       <w:r>
-        <w:t>Audio file: none assigned; voice decision pending</w:t>
+        <w:t>Source: pcRenderS1OrganizeWorkspace</w:t>
+        <w:br/>
+      </w:r>
+      <w:r>
+        <w:t>File: assets/audio/voice/students/maya/scenario-01/maya_s01_11.mp3</w:t>
       </w:r>
     </w:p>
     <w:p>
@@ -440,29 +508,34 @@
       </w:r>
     </w:p>
     <w:p>
+      <w:pPr>
+        <w:keepNext/>
+        <w:keepLines/>
+      </w:pPr>
       <w:r>
+        <w:rPr>
+          <w:b/>
+        </w:rPr>
         <w:t>The headers make the module easier to scan, but some placements still make the learning path hard to predict.</w:t>
       </w:r>
     </w:p>
     <w:p>
       <w:pPr>
-        <w:spacing w:after="240"/>
+        <w:keepLines/>
       </w:pPr>
       <w:r>
         <w:rPr>
           <w:i/>
-          <w:color w:val="4D5B68"/>
-          <w:sz w:val="17"/>
         </w:rPr>
-        <w:t>Conditional on-screen quote  |  Source: pcEvaluateS1Organization default</w:t>
+        <w:t>Use: Optional branch voice if approved  |  Expression: neutral</w:t>
+        <w:br/>
       </w:r>
-    </w:p>
-    <w:p>
-      <w:pPr>
-        <w:spacing w:after="200"/>
-      </w:pPr>
       <w:r>
-        <w:t>Audio file: none assigned; voice decision pending</w:t>
+        <w:t>Source: pcEvaluateS1Organization default branch</w:t>
+        <w:br/>
+      </w:r>
+      <w:r>
+        <w:t>File: assets/audio/voice/students/maya/scenario-01/maya_s01_12.mp3</w:t>
       </w:r>
     </w:p>
     <w:p>
@@ -474,29 +547,34 @@
       </w:r>
     </w:p>
     <w:p>
+      <w:pPr>
+        <w:keepNext/>
+        <w:keepLines/>
+      </w:pPr>
       <w:r>
+        <w:rPr>
+          <w:b/>
+        </w:rPr>
         <w:t>This is much easier to scan. The titles tell me what each activity is for, and the headers give me a clear path from preparation to practice to evidence.</w:t>
       </w:r>
     </w:p>
     <w:p>
       <w:pPr>
-        <w:spacing w:after="240"/>
+        <w:keepLines/>
       </w:pPr>
       <w:r>
         <w:rPr>
           <w:i/>
-          <w:color w:val="4D5B68"/>
-          <w:sz w:val="17"/>
         </w:rPr>
-        <w:t>Conditional on-screen quote  |  Source: pcEvaluateS1Organization all match</w:t>
+        <w:t>Use: Optional branch voice if approved  |  Expression: neutral</w:t>
+        <w:br/>
       </w:r>
-    </w:p>
-    <w:p>
-      <w:pPr>
-        <w:spacing w:after="200"/>
-      </w:pPr>
       <w:r>
-        <w:t>Audio file: none assigned; voice decision pending</w:t>
+        <w:t>Source: pcEvaluateS1Organization all-match branch</w:t>
+        <w:br/>
+      </w:r>
+      <w:r>
+        <w:t>File: assets/audio/voice/students/maya/scenario-01/maya_s01_13.mp3</w:t>
       </w:r>
     </w:p>
     <w:p>
@@ -508,29 +586,34 @@
       </w:r>
     </w:p>
     <w:p>
+      <w:pPr>
+        <w:keepNext/>
+        <w:keepLines/>
+      </w:pPr>
       <w:r>
+        <w:rPr>
+          <w:b/>
+        </w:rPr>
         <w:t>This is easier to scan, but I would still pause at “[activity title].” I am not sure it belongs under [chosen header] if its main job is [suggested header].</w:t>
       </w:r>
     </w:p>
     <w:p>
       <w:pPr>
-        <w:spacing w:after="240"/>
+        <w:keepLines/>
       </w:pPr>
       <w:r>
         <w:rPr>
           <w:i/>
-          <w:color w:val="4D5B68"/>
-          <w:sz w:val="17"/>
         </w:rPr>
-        <w:t>Conditional on-screen quote  |  Source: pcEvaluateS1Organization three or four match; placeholders replace runtime values</w:t>
+        <w:t>Use: On-screen only dynamic branch  |  Expression: neutral</w:t>
+        <w:br/>
       </w:r>
-    </w:p>
-    <w:p>
-      <w:pPr>
-        <w:spacing w:after="200"/>
-      </w:pPr>
       <w:r>
-        <w:t>Audio file: none assigned; voice decision pending</w:t>
+        <w:t>Source: pcEvaluateS1Organization three-or-four-match branch</w:t>
+        <w:br/>
+      </w:r>
+      <w:r>
+        <w:t>File: no fixed recording; the wording contains runtime values</w:t>
       </w:r>
     </w:p>
     <w:p>
@@ -542,29 +625,34 @@
       </w:r>
     </w:p>
     <w:p>
+      <w:pPr>
+        <w:keepNext/>
+        <w:keepLines/>
+      </w:pPr>
       <w:r>
+        <w:rPr>
+          <w:b/>
+        </w:rPr>
         <w:t>The headers help me see the structure, but the path still feels mixed up. [activity titles] would make me stop and wonder what I am supposed to be doing at that point.</w:t>
       </w:r>
     </w:p>
     <w:p>
       <w:pPr>
-        <w:spacing w:after="240"/>
+        <w:keepLines/>
       </w:pPr>
       <w:r>
         <w:rPr>
           <w:i/>
-          <w:color w:val="4D5B68"/>
-          <w:sz w:val="17"/>
         </w:rPr>
-        <w:t>Conditional on-screen quote  |  Source: pcEvaluateS1Organization fewer than three match; placeholder replaces runtime values</w:t>
+        <w:t>Use: On-screen only dynamic branch  |  Expression: neutral</w:t>
+        <w:br/>
       </w:r>
-    </w:p>
-    <w:p>
-      <w:pPr>
-        <w:spacing w:after="200"/>
-      </w:pPr>
       <w:r>
-        <w:t>Audio file: none assigned; voice decision pending</w:t>
+        <w:t>Source: pcEvaluateS1Organization fewer-than-three-match branch</w:t>
+        <w:br/>
+      </w:r>
+      <w:r>
+        <w:t>File: no fixed recording; the wording contains runtime values</w:t>
       </w:r>
     </w:p>
     <w:p>
@@ -572,33 +660,38 @@
         <w:pStyle w:val="Heading2"/>
       </w:pPr>
       <w:r>
-        <w:t>M16  Revised module</w:t>
+        <w:t>M16  Alignment diagnosis</w:t>
       </w:r>
     </w:p>
     <w:p>
+      <w:pPr>
+        <w:keepNext/>
+        <w:keepLines/>
+      </w:pPr>
       <w:r>
+        <w:rPr>
+          <w:b/>
+        </w:rPr>
         <w:t>The module is clearer now. I can see what I am supposed to do. The question is whether any of this actually lets me show the performance the instructor cares about.</w:t>
       </w:r>
     </w:p>
     <w:p>
       <w:pPr>
-        <w:spacing w:after="240"/>
+        <w:keepLines/>
       </w:pPr>
       <w:r>
         <w:rPr>
           <w:i/>
-          <w:color w:val="4D5B68"/>
-          <w:sz w:val="17"/>
         </w:rPr>
-        <w:t>On-screen quote  |  Source: pcRenderS1RevisedModuleOverview</w:t>
+        <w:t>Use: Optional voice if approved  |  Expression: neutral</w:t>
+        <w:br/>
       </w:r>
-    </w:p>
-    <w:p>
-      <w:pPr>
-        <w:spacing w:after="200"/>
-      </w:pPr>
       <w:r>
-        <w:t>Audio file: none assigned; voice decision pending</w:t>
+        <w:t>Source: pcRenderS1Diagnosis</w:t>
+        <w:br/>
+      </w:r>
+      <w:r>
+        <w:t>File: assets/audio/voice/students/maya/scenario-01/maya_s01_16.mp3</w:t>
       </w:r>
     </w:p>
     <w:p>
@@ -606,33 +699,38 @@
         <w:pStyle w:val="Heading2"/>
       </w:pPr>
       <w:r>
-        <w:t>M17  Diagnosis</w:t>
+        <w:t>M17  Analysis complete</w:t>
       </w:r>
     </w:p>
     <w:p>
+      <w:pPr>
+        <w:keepNext/>
+        <w:keepLines/>
+      </w:pPr>
       <w:r>
+        <w:rPr>
+          <w:b/>
+        </w:rPr>
         <w:t>That makes sense. I can get through the module more easily now, but the quiz still does not show whether I can analyze a problem and recommend a response.</w:t>
       </w:r>
     </w:p>
     <w:p>
       <w:pPr>
-        <w:spacing w:after="240"/>
+        <w:keepLines/>
       </w:pPr>
       <w:r>
         <w:rPr>
           <w:i/>
-          <w:color w:val="4D5B68"/>
-          <w:sz w:val="17"/>
         </w:rPr>
-        <w:t>On-screen quote  |  Source: pcRenderS1Diagnosis</w:t>
+        <w:t>Use: Optional voice if approved  |  Expression: neutral</w:t>
+        <w:br/>
       </w:r>
-    </w:p>
-    <w:p>
-      <w:pPr>
-        <w:spacing w:after="200"/>
-      </w:pPr>
       <w:r>
-        <w:t>Audio file: none assigned; voice decision pending</w:t>
+        <w:t>Source: pcRenderS1BabbageComplete</w:t>
+        <w:br/>
+      </w:r>
+      <w:r>
+        <w:t>File: assets/audio/voice/students/maya/scenario-01/maya_s01_17.mp3</w:t>
       </w:r>
     </w:p>
     <w:p>
@@ -644,29 +742,34 @@
       </w:r>
     </w:p>
     <w:p>
+      <w:pPr>
+        <w:keepNext/>
+        <w:keepLines/>
+      </w:pPr>
       <w:r>
+        <w:rPr>
+          <w:b/>
+        </w:rPr>
         <w:t>That is the difference I was missing. The module is easier to navigate now, but I still need a chance to show that I can analyze a problem and recommend a response.</w:t>
       </w:r>
     </w:p>
     <w:p>
       <w:pPr>
-        <w:spacing w:after="240"/>
+        <w:keepLines/>
       </w:pPr>
       <w:r>
         <w:rPr>
           <w:i/>
-          <w:color w:val="4D5B68"/>
-          <w:sz w:val="17"/>
         </w:rPr>
-        <w:t>Conditional on-screen quote  |  Source: pcRenderS1DiagnosisResult correct</w:t>
+        <w:t>Use: Optional correct-choice branch voice  |  Expression: neutral</w:t>
+        <w:br/>
       </w:r>
-    </w:p>
-    <w:p>
-      <w:pPr>
-        <w:spacing w:after="200"/>
-      </w:pPr>
       <w:r>
-        <w:t>Audio file: none assigned; voice decision pending</w:t>
+        <w:t>Source: pcRenderS1DiagnosisResult correct branch</w:t>
+        <w:br/>
+      </w:r>
+      <w:r>
+        <w:t>File: assets/audio/voice/students/maya/scenario-01/maya_s01_18.mp3</w:t>
       </w:r>
     </w:p>
     <w:p>
@@ -678,29 +781,34 @@
       </w:r>
     </w:p>
     <w:p>
+      <w:pPr>
+        <w:keepNext/>
+        <w:keepLines/>
+      </w:pPr>
       <w:r>
+        <w:rPr>
+          <w:b/>
+        </w:rPr>
         <w:t>The module is clearer now. I still need to compare what I completed with what the instructor says I should actually be able to do.</w:t>
       </w:r>
     </w:p>
     <w:p>
       <w:pPr>
-        <w:spacing w:after="240"/>
+        <w:keepLines/>
       </w:pPr>
       <w:r>
         <w:rPr>
           <w:i/>
-          <w:color w:val="4D5B68"/>
-          <w:sz w:val="17"/>
         </w:rPr>
-        <w:t>Conditional on-screen quote  |  Source: pcRenderS1DiagnosisResult other choices</w:t>
+        <w:t>Use: Optional other-choice branch voice  |  Expression: neutral</w:t>
+        <w:br/>
       </w:r>
-    </w:p>
-    <w:p>
-      <w:pPr>
-        <w:spacing w:after="200"/>
-      </w:pPr>
       <w:r>
-        <w:t>Audio file: none assigned; voice decision pending</w:t>
+        <w:t>Source: pcRenderS1DiagnosisResult other-choice branch</w:t>
+        <w:br/>
+      </w:r>
+      <w:r>
+        <w:t>File: assets/audio/voice/students/maya/scenario-01/maya_s01_19.mp3</w:t>
       </w:r>
     </w:p>
     <w:p>
@@ -708,7 +816,7 @@
         <w:pStyle w:val="Heading1"/>
       </w:pPr>
       <w:r>
-        <w:t>Recording and handoff</w:t>
+        <w:t>Recording handoff</w:t>
       </w:r>
     </w:p>
     <w:p>
@@ -716,7 +824,7 @@
         <w:pStyle w:val="ListBullet"/>
       </w:pPr>
       <w:r>
-        <w:t>Speak only the approved line text. Do not read the ID, scene name, status, or source note.</w:t>
+        <w:t>Speak only the exact line text. Do not read the ID, scene, source, or filename.</w:t>
       </w:r>
     </w:p>
     <w:p>
@@ -724,7 +832,7 @@
         <w:pStyle w:val="ListBullet"/>
       </w:pPr>
       <w:r>
-        <w:t>Use one file per approved line and put the final file name in the voice tracker.</w:t>
+        <w:t>Leave clean silence at the beginning and end. Check for clipped words, room noise, and inconsistent volume.</w:t>
       </w:r>
     </w:p>
     <w:p>
@@ -732,7 +840,7 @@
         <w:pStyle w:val="ListBullet"/>
       </w:pPr>
       <w:r>
-        <w:t>Leave clean silence at the beginning and end. Check for clipped words and background noise.</w:t>
+        <w:t>Export MP3 files at 44.1 or 48 kHz with consistent settings across the character set.</w:t>
       </w:r>
     </w:p>
     <w:p>
@@ -740,32 +848,17 @@
         <w:pStyle w:val="ListBullet"/>
       </w:pPr>
       <w:r>
-        <w:t>Preserve the source wording unless the producer updates the game and this script together.</w:t>
+        <w:t>If the wording changes after recording, update the application source, tracker, and script together before replacing the file.</w:t>
       </w:r>
     </w:p>
     <w:sectPr>
-      <w:footerReference w:type="default" r:id="rId9"/>
       <w:pgSz w:w="12240" w:h="15840"/>
-      <w:pgMar w:top="1008" w:right="1152" w:bottom="936" w:left="1152" w:header="720" w:footer="720" w:gutter="0"/>
+      <w:pgMar w:top="936" w:right="1037" w:bottom="936" w:left="1037" w:header="720" w:footer="720" w:gutter="0"/>
       <w:cols w:space="720"/>
       <w:docGrid w:linePitch="360"/>
     </w:sectPr>
   </w:body>
 </w:document>
-</file>
-
-<file path=word/footer1.xml><?xml version="1.0" encoding="utf-8"?>
-<w:ftr xmlns:m="http://schemas.openxmlformats.org/officeDocument/2006/math" xmlns:mc="http://schemas.openxmlformats.org/markup-compatibility/2006" xmlns:mo="http://schemas.microsoft.com/office/mac/office/2008/main" xmlns:mv="urn:schemas-microsoft-com:mac:vml" xmlns:o="urn:schemas-microsoft-com:office:office" xmlns:r="http://schemas.openxmlformats.org/officeDocument/2006/relationships" xmlns:v="urn:schemas-microsoft-com:vml" xmlns:w10="urn:schemas-microsoft-com:office:word" xmlns:w14="http://schemas.microsoft.com/office/word/2010/wordml" xmlns:w="http://schemas.openxmlformats.org/wordprocessingml/2006/main" xmlns:wne="http://schemas.microsoft.com/office/word/2006/wordml" xmlns:wp14="http://schemas.microsoft.com/office/word/2010/wordprocessingDrawing" xmlns:wp="http://schemas.openxmlformats.org/drawingml/2006/wordprocessingDrawing" xmlns:wpc="http://schemas.microsoft.com/office/word/2010/wordprocessingCanvas" xmlns:wpg="http://schemas.microsoft.com/office/word/2010/wordprocessingGroup" xmlns:wpi="http://schemas.microsoft.com/office/word/2010/wordprocessingInk" xmlns:wps="http://schemas.microsoft.com/office/word/2010/wordprocessingShape" mc:Ignorable="w14 wp14">
-  <w:p>
-    <w:pPr>
-      <w:pStyle w:val="Footer"/>
-      <w:jc w:val="center"/>
-    </w:pPr>
-    <w:r>
-      <w:t>PromptCraft V429  |  Patch 580 source  |  Scenario 1 only</w:t>
-    </w:r>
-  </w:p>
-</w:ftr>
 </file>
 
 <file path=word/numbering.xml><?xml version="1.0" encoding="utf-8"?>
@@ -1132,10 +1225,11 @@
     <w:qFormat/>
     <w:rsid w:val="00FC693F"/>
     <w:pPr>
-      <w:spacing w:after="140"/>
+      <w:spacing w:after="120" w:line="259" w:lineRule="auto"/>
     </w:pPr>
     <w:rPr>
       <w:rFonts w:ascii="Aptos" w:hAnsi="Aptos"/>
+      <w:color w:val="000000"/>
       <w:sz w:val="21"/>
     </w:rPr>
   </w:style>
@@ -1194,7 +1288,7 @@
     <w:pPr>
       <w:keepNext/>
       <w:keepLines/>
-      <w:spacing w:before="480" w:after="0"/>
+      <w:spacing w:before="200" w:after="100"/>
       <w:outlineLvl w:val="0"/>
     </w:pPr>
     <w:rPr>
@@ -1202,7 +1296,7 @@
       <w:b/>
       <w:bCs/>
       <w:color w:val="000000"/>
-      <w:sz w:val="28"/>
+      <w:sz w:val="32"/>
       <w:szCs w:val="28"/>
     </w:rPr>
   </w:style>
@@ -1218,15 +1312,15 @@
     <w:pPr>
       <w:keepNext/>
       <w:keepLines/>
-      <w:spacing w:before="200" w:after="0"/>
+      <w:spacing w:before="120" w:after="100"/>
       <w:outlineLvl w:val="1"/>
     </w:pPr>
     <w:rPr>
-      <w:rFonts w:asciiTheme="majorHAnsi" w:eastAsiaTheme="majorEastAsia" w:hAnsiTheme="majorHAnsi" w:cstheme="majorBidi" w:ascii="Aptos Display" w:hAnsi="Aptos Display"/>
+      <w:rFonts w:asciiTheme="majorHAnsi" w:eastAsiaTheme="majorEastAsia" w:hAnsiTheme="majorHAnsi" w:cstheme="majorBidi" w:ascii="Aptos" w:hAnsi="Aptos"/>
       <w:b/>
       <w:bCs/>
       <w:color w:val="000000"/>
-      <w:sz w:val="22"/>
+      <w:sz w:val="24"/>
       <w:szCs w:val="26"/>
     </w:rPr>
   </w:style>
@@ -1480,18 +1574,20 @@
     <w:qFormat/>
     <w:rsid w:val="00FC693F"/>
     <w:pPr>
+      <w:keepNext/>
       <w:pBdr>
         <w:bottom w:val="single" w:sz="8" w:space="4" w:color="4F81BD" w:themeColor="accent1"/>
       </w:pBdr>
-      <w:spacing w:after="300" w:line="240" w:lineRule="auto"/>
+      <w:spacing w:after="100" w:line="240" w:lineRule="auto" w:before="120"/>
       <w:contextualSpacing/>
     </w:pPr>
     <w:rPr>
       <w:rFonts w:asciiTheme="majorHAnsi" w:eastAsiaTheme="majorEastAsia" w:hAnsiTheme="majorHAnsi" w:cstheme="majorBidi" w:ascii="Aptos Display" w:hAnsi="Aptos Display"/>
+      <w:b/>
       <w:color w:val="000000"/>
       <w:spacing w:val="5"/>
       <w:kern w:val="28"/>
-      <w:sz w:val="44"/>
+      <w:sz w:val="48"/>
       <w:szCs w:val="52"/>
     </w:rPr>
   </w:style>
@@ -1519,15 +1615,18 @@
     <w:qFormat/>
     <w:rsid w:val="00FC693F"/>
     <w:pPr>
+      <w:keepNext/>
       <w:numPr>
         <w:ilvl w:val="1"/>
       </w:numPr>
+      <w:spacing w:before="120" w:after="100"/>
     </w:pPr>
     <w:rPr>
-      <w:rFonts w:asciiTheme="majorHAnsi" w:eastAsiaTheme="majorEastAsia" w:hAnsiTheme="majorHAnsi" w:cstheme="majorBidi"/>
+      <w:rFonts w:asciiTheme="majorHAnsi" w:eastAsiaTheme="majorEastAsia" w:hAnsiTheme="majorHAnsi" w:cstheme="majorBidi" w:ascii="Aptos" w:hAnsi="Aptos"/>
+      <w:b w:val="0"/>
       <w:i/>
       <w:iCs/>
-      <w:color w:val="4F81BD" w:themeColor="accent1"/>
+      <w:color w:val="000000"/>
       <w:spacing w:val="15"/>
       <w:sz w:val="24"/>
       <w:szCs w:val="24"/>

</xml_diff>